<commit_message>
Updated screenshots to reflect incremental state as each task was done across Experiments 1-5
</commit_message>
<xml_diff>
--- a/writeups/Experiment_1_HTML5_Writeup.docx
+++ b/writeups/Experiment_1_HTML5_Writeup.docx
@@ -1159,7 +1159,7 @@
       <w:r>
         <w:drawing>
           <wp:inline xmlns:a="http://schemas.openxmlformats.org/drawingml/2006/main" xmlns:pic="http://schemas.openxmlformats.org/drawingml/2006/picture">
-            <wp:extent cx="5486400" cy="4500562"/>
+            <wp:extent cx="5486400" cy="4071938"/>
             <wp:docPr id="3" name="Picture 3"/>
             <wp:cNvGraphicFramePr>
               <a:graphicFrameLocks noChangeAspect="1"/>
@@ -1180,7 +1180,7 @@
                   <pic:spPr>
                     <a:xfrm>
                       <a:off x="0" y="0"/>
-                      <a:ext cx="5486400" cy="4500562"/>
+                      <a:ext cx="5486400" cy="4071938"/>
                     </a:xfrm>
                     <a:prstGeom prst="rect"/>
                   </pic:spPr>
@@ -1212,7 +1212,7 @@
       <w:r>
         <w:drawing>
           <wp:inline xmlns:a="http://schemas.openxmlformats.org/drawingml/2006/main" xmlns:pic="http://schemas.openxmlformats.org/drawingml/2006/picture">
-            <wp:extent cx="5486400" cy="3643313"/>
+            <wp:extent cx="5486400" cy="3857625"/>
             <wp:docPr id="4" name="Picture 4"/>
             <wp:cNvGraphicFramePr>
               <a:graphicFrameLocks noChangeAspect="1"/>
@@ -1233,7 +1233,7 @@
                   <pic:spPr>
                     <a:xfrm>
                       <a:off x="0" y="0"/>
-                      <a:ext cx="5486400" cy="3643313"/>
+                      <a:ext cx="5486400" cy="3857625"/>
                     </a:xfrm>
                     <a:prstGeom prst="rect"/>
                   </pic:spPr>
@@ -1265,7 +1265,7 @@
       <w:r>
         <w:drawing>
           <wp:inline xmlns:a="http://schemas.openxmlformats.org/drawingml/2006/main" xmlns:pic="http://schemas.openxmlformats.org/drawingml/2006/picture">
-            <wp:extent cx="5486400" cy="2231756"/>
+            <wp:extent cx="5486400" cy="1928813"/>
             <wp:docPr id="5" name="Picture 5"/>
             <wp:cNvGraphicFramePr>
               <a:graphicFrameLocks noChangeAspect="1"/>
@@ -1286,7 +1286,7 @@
                   <pic:spPr>
                     <a:xfrm>
                       <a:off x="0" y="0"/>
-                      <a:ext cx="5486400" cy="2231756"/>
+                      <a:ext cx="5486400" cy="1928813"/>
                     </a:xfrm>
                     <a:prstGeom prst="rect"/>
                   </pic:spPr>
@@ -1318,7 +1318,7 @@
       <w:r>
         <w:drawing>
           <wp:inline xmlns:a="http://schemas.openxmlformats.org/drawingml/2006/main" xmlns:pic="http://schemas.openxmlformats.org/drawingml/2006/picture">
-            <wp:extent cx="5486400" cy="3943350"/>
+            <wp:extent cx="5486400" cy="3643313"/>
             <wp:docPr id="6" name="Picture 6"/>
             <wp:cNvGraphicFramePr>
               <a:graphicFrameLocks noChangeAspect="1"/>
@@ -1339,7 +1339,7 @@
                   <pic:spPr>
                     <a:xfrm>
                       <a:off x="0" y="0"/>
-                      <a:ext cx="5486400" cy="3943350"/>
+                      <a:ext cx="5486400" cy="3643313"/>
                     </a:xfrm>
                     <a:prstGeom prst="rect"/>
                   </pic:spPr>
@@ -1371,7 +1371,7 @@
       <w:r>
         <w:drawing>
           <wp:inline xmlns:a="http://schemas.openxmlformats.org/drawingml/2006/main" xmlns:pic="http://schemas.openxmlformats.org/drawingml/2006/picture">
-            <wp:extent cx="5486400" cy="3643313"/>
+            <wp:extent cx="5486400" cy="3214688"/>
             <wp:docPr id="7" name="Picture 7"/>
             <wp:cNvGraphicFramePr>
               <a:graphicFrameLocks noChangeAspect="1"/>
@@ -1392,7 +1392,7 @@
                   <pic:spPr>
                     <a:xfrm>
                       <a:off x="0" y="0"/>
-                      <a:ext cx="5486400" cy="3643313"/>
+                      <a:ext cx="5486400" cy="3214688"/>
                     </a:xfrm>
                     <a:prstGeom prst="rect"/>
                   </pic:spPr>
@@ -1477,7 +1477,7 @@
       <w:r>
         <w:drawing>
           <wp:inline xmlns:a="http://schemas.openxmlformats.org/drawingml/2006/main" xmlns:pic="http://schemas.openxmlformats.org/drawingml/2006/picture">
-            <wp:extent cx="5486400" cy="2882685"/>
+            <wp:extent cx="5486400" cy="2571750"/>
             <wp:docPr id="9" name="Picture 9"/>
             <wp:cNvGraphicFramePr>
               <a:graphicFrameLocks noChangeAspect="1"/>
@@ -1498,7 +1498,7 @@
                   <pic:spPr>
                     <a:xfrm>
                       <a:off x="0" y="0"/>
-                      <a:ext cx="5486400" cy="2882685"/>
+                      <a:ext cx="5486400" cy="2571750"/>
                     </a:xfrm>
                     <a:prstGeom prst="rect"/>
                   </pic:spPr>

</xml_diff>